<commit_message>
Update SSU10 dodao ime prodavnice
</commit_message>
<xml_diff>
--- a/SSU/SSU 10 - Administracija sistema.docx
+++ b/SSU/SSU 10 - Administracija sistema.docx
@@ -3106,7 +3106,103 @@
         <w:rPr>
           <w:rFonts w:ascii="Calibri" w:hAnsi="Calibri"/>
         </w:rPr>
-        <w:t>5. Administrator popunjava informaciju o ceni i link do stranice gde se komponenta prodaje</w:t>
+        <w:t xml:space="preserve">5. Administrator </w:t>
+      </w:r>
+      <w:proofErr w:type="spellStart"/>
+      <w:r>
+        <w:rPr>
+          <w:rFonts w:ascii="Calibri" w:hAnsi="Calibri"/>
+        </w:rPr>
+        <w:t>popunjava</w:t>
+      </w:r>
+      <w:proofErr w:type="spellEnd"/>
+      <w:r>
+        <w:rPr>
+          <w:rFonts w:ascii="Calibri" w:hAnsi="Calibri"/>
+        </w:rPr>
+        <w:t xml:space="preserve"> </w:t>
+      </w:r>
+      <w:proofErr w:type="spellStart"/>
+      <w:r>
+        <w:rPr>
+          <w:rFonts w:ascii="Calibri" w:hAnsi="Calibri"/>
+        </w:rPr>
+        <w:t>informaciju</w:t>
+      </w:r>
+      <w:proofErr w:type="spellEnd"/>
+      <w:r>
+        <w:rPr>
+          <w:rFonts w:ascii="Calibri" w:hAnsi="Calibri"/>
+        </w:rPr>
+        <w:t xml:space="preserve"> o</w:t>
+      </w:r>
+      <w:r>
+        <w:rPr>
+          <w:rFonts w:ascii="Calibri" w:hAnsi="Calibri"/>
+        </w:rPr>
+        <w:t xml:space="preserve"> </w:t>
+      </w:r>
+      <w:proofErr w:type="spellStart"/>
+      <w:r>
+        <w:rPr>
+          <w:rFonts w:ascii="Calibri" w:hAnsi="Calibri"/>
+        </w:rPr>
+        <w:t>nazivu</w:t>
+      </w:r>
+      <w:proofErr w:type="spellEnd"/>
+      <w:r>
+        <w:rPr>
+          <w:rFonts w:ascii="Calibri" w:hAnsi="Calibri"/>
+        </w:rPr>
+        <w:t xml:space="preserve"> </w:t>
+      </w:r>
+      <w:proofErr w:type="spellStart"/>
+      <w:r>
+        <w:rPr>
+          <w:rFonts w:ascii="Calibri" w:hAnsi="Calibri"/>
+        </w:rPr>
+        <w:t>prodavnice</w:t>
+      </w:r>
+      <w:proofErr w:type="spellEnd"/>
+      <w:r>
+        <w:rPr>
+          <w:rFonts w:ascii="Calibri" w:hAnsi="Calibri"/>
+        </w:rPr>
+        <w:t>,</w:t>
+      </w:r>
+      <w:r>
+        <w:rPr>
+          <w:rFonts w:ascii="Calibri" w:hAnsi="Calibri"/>
+        </w:rPr>
+        <w:t xml:space="preserve"> </w:t>
+      </w:r>
+      <w:proofErr w:type="spellStart"/>
+      <w:r>
+        <w:rPr>
+          <w:rFonts w:ascii="Calibri" w:hAnsi="Calibri"/>
+        </w:rPr>
+        <w:t>ceni</w:t>
+      </w:r>
+      <w:proofErr w:type="spellEnd"/>
+      <w:r>
+        <w:rPr>
+          <w:rFonts w:ascii="Calibri" w:hAnsi="Calibri"/>
+        </w:rPr>
+        <w:t xml:space="preserve"> </w:t>
+      </w:r>
+      <w:proofErr w:type="spellStart"/>
+      <w:r>
+        <w:rPr>
+          <w:rFonts w:ascii="Calibri" w:hAnsi="Calibri"/>
+        </w:rPr>
+        <w:t>i</w:t>
+      </w:r>
+      <w:proofErr w:type="spellEnd"/>
+      <w:r>
+        <w:rPr>
+          <w:rFonts w:ascii="Calibri" w:hAnsi="Calibri"/>
+        </w:rPr>
+        <w:t xml:space="preserve"> link do stranice gde se komponenta prodaje</w:t>
       </w:r>
     </w:p>
     <w:p>

</xml_diff>